<commit_message>
Updated degree and about section and headline stats
</commit_message>
<xml_diff>
--- a/assets/Ethan_Haskell_Resume.docx
+++ b/assets/Ethan_Haskell_Resume.docx
@@ -199,7 +199,7 @@
           <w:sz w:val="17"/>
           <w:szCs w:val="17"/>
         </w:rPr>
-        <w:t xml:space="preserve">Cybersecurity student at Bowie State University with hands-on experience across enterprise network administration, workstation support, and self-hosted server environments, currently working to complete the CompTIA Network+ and Security+ certifications. Experienced working directly with non-technical staff and end users to resolve issues and document solutions through IT internships with the Supreme Court of the United States and the City of Baltimore. Eagle Scout known for reliability, professionalism, and clear communication.</w:t>
+        <w:t xml:space="preserve">Networking infrastructure student with a focus in cybersecurity at Bowie State University, with hands-on experience in enterprise network administration, workstation support, and self-hosted servers; pursuing CompTIA Network+ and Security+. Experienced resolving issues for non-technical staff and end users through IT internships with the Supreme Court of the United States and the City of Baltimore. Eagle Scout known for reliability, professionalism, and clear communication.</w:t>
       </w:r>
     </w:p>
     <w:p>
@@ -262,7 +262,7 @@
                 <w:sz w:val="19"/>
                 <w:szCs w:val="19"/>
               </w:rPr>
-              <w:t xml:space="preserve">B.S. Computer Technology in Cybersecurity — Bowie State University, Maryland</w:t>
+              <w:t xml:space="preserve">B.S. Networking Infrastructure, Focus in Cybersecurity — Bowie State University</w:t>
             </w:r>
           </w:p>
         </w:tc>
@@ -870,26 +870,7 @@
           <w:sz w:val="17"/>
           <w:szCs w:val="17"/>
         </w:rPr>
-        <w:t xml:space="preserve">Tracked and resolved issues through IT ticketing systems, following documentation standards for hardware deployments and support requests.</w:t>
-      </w:r>
-    </w:p>
-    <w:p>
-      <w:pPr>
-        <w:pStyle w:val="ListParagraph"/>
-        <w:numPr>
-          <w:ilvl w:val="0"/>
-          <w:numId w:val="1"/>
-        </w:numPr>
-        <w:spacing w:after="11"/>
-      </w:pPr>
-      <w:r>
-        <w:rPr>
-          <w:rFonts w:ascii="IBM Plex Sans" w:cs="IBM Plex Sans" w:eastAsia="IBM Plex Sans" w:hAnsi="IBM Plex Sans"/>
-          <w:color w:val="23262B"/>
-          <w:sz w:val="17"/>
-          <w:szCs w:val="17"/>
-        </w:rPr>
-        <w:t xml:space="preserve">Applied customer service best practices while balancing network administration duties with hands-on workstation support.</w:t>
+        <w:t xml:space="preserve">Tracked and resolved issues through IT ticketing systems, applying customer service best practices and following documentation standards for hardware deployments and support requests.</w:t>
       </w:r>
     </w:p>
     <w:tbl>

</xml_diff>

<commit_message>
Add CCNA target date
</commit_message>
<xml_diff>
--- a/assets/Ethan_Haskell_Resume.docx
+++ b/assets/Ethan_Haskell_Resume.docx
@@ -199,7 +199,7 @@
           <w:sz w:val="17"/>
           <w:szCs w:val="17"/>
         </w:rPr>
-        <w:t xml:space="preserve">Networking infrastructure student with a focus in cybersecurity at Bowie State University, with hands-on experience in enterprise network administration, workstation support, and self-hosted servers; pursuing CompTIA Network+ and Security+. Experienced resolving issues for non-technical staff and end users through IT internships with the Supreme Court of the United States and the City of Baltimore. Eagle Scout known for reliability, professionalism, and clear communication.</w:t>
+        <w:t xml:space="preserve">Networking infrastructure student with a focus in cybersecurity at Bowie State University, with hands-on experience in enterprise network administration, workstation support, and self-hosted servers; pursuing the Cisco CCNA (target Jan. 2027) and CompTIA Network+ and Security+. Experienced resolving issues for non-technical staff and end users through IT internships with the Supreme Court of the United States and the City of Baltimore. Eagle Scout known for reliability, professionalism, and clear communication.</w:t>
       </w:r>
     </w:p>
     <w:p>
@@ -358,7 +358,7 @@
           <w:sz w:val="18"/>
           <w:szCs w:val="18"/>
         </w:rPr>
-        <w:t xml:space="preserve">CompTIA Network+ and Security+ — in progress</w:t>
+        <w:t xml:space="preserve">Cisco Certified Network Associate (CCNA) — target Jan. 2027  |  CompTIA Network+ and Security+ — in progress</w:t>
       </w:r>
     </w:p>
     <w:p>

</xml_diff>